<commit_message>
Updates all VERAIn documentation and manuals for the 4.1 release
CASL Ticket #- 5941
</commit_message>
<xml_diff>
--- a/verain/docs/Users_Manual/casl/cover.docx
+++ b/verain/docs/Users_Manual/casl/cover.docx
@@ -1,6 +1,6 @@
 
 <file path=word/document.xml><?xml version="1.0" encoding="utf-8"?>
-<w:document xmlns:wpc="http://schemas.microsoft.com/office/word/2010/wordprocessingCanvas" xmlns:cx="http://schemas.microsoft.com/office/drawing/2014/chartex" xmlns:mc="http://schemas.openxmlformats.org/markup-compatibility/2006" xmlns:o="urn:schemas-microsoft-com:office:office" xmlns:r="http://schemas.openxmlformats.org/officeDocument/2006/relationships" xmlns:m="http://schemas.openxmlformats.org/officeDocument/2006/math" xmlns:v="urn:schemas-microsoft-com:vml" xmlns:wp14="http://schemas.microsoft.com/office/word/2010/wordprocessingDrawing" xmlns:wp="http://schemas.openxmlformats.org/drawingml/2006/wordprocessingDrawing" xmlns:w10="urn:schemas-microsoft-com:office:word" xmlns:w="http://schemas.openxmlformats.org/wordprocessingml/2006/main" xmlns:w14="http://schemas.microsoft.com/office/word/2010/wordml" xmlns:w15="http://schemas.microsoft.com/office/word/2012/wordml" xmlns:w16se="http://schemas.microsoft.com/office/word/2015/wordml/symex" xmlns:wpg="http://schemas.microsoft.com/office/word/2010/wordprocessingGroup" xmlns:wpi="http://schemas.microsoft.com/office/word/2010/wordprocessingInk" xmlns:wne="http://schemas.microsoft.com/office/word/2006/wordml" xmlns:wps="http://schemas.microsoft.com/office/word/2010/wordprocessingShape" mc:Ignorable="w14 w15 w16se wp14">
+<w:document xmlns:wpc="http://schemas.microsoft.com/office/word/2010/wordprocessingCanvas" xmlns:cx="http://schemas.microsoft.com/office/drawing/2014/chartex" xmlns:cx1="http://schemas.microsoft.com/office/drawing/2015/9/8/chartex" xmlns:cx2="http://schemas.microsoft.com/office/drawing/2015/10/21/chartex" xmlns:cx3="http://schemas.microsoft.com/office/drawing/2016/5/9/chartex" xmlns:cx4="http://schemas.microsoft.com/office/drawing/2016/5/10/chartex" xmlns:cx5="http://schemas.microsoft.com/office/drawing/2016/5/11/chartex" xmlns:cx6="http://schemas.microsoft.com/office/drawing/2016/5/12/chartex" xmlns:cx7="http://schemas.microsoft.com/office/drawing/2016/5/13/chartex" xmlns:cx8="http://schemas.microsoft.com/office/drawing/2016/5/14/chartex" xmlns:mc="http://schemas.openxmlformats.org/markup-compatibility/2006" xmlns:aink="http://schemas.microsoft.com/office/drawing/2016/ink" xmlns:am3d="http://schemas.microsoft.com/office/drawing/2017/model3d" xmlns:o="urn:schemas-microsoft-com:office:office" xmlns:r="http://schemas.openxmlformats.org/officeDocument/2006/relationships" xmlns:m="http://schemas.openxmlformats.org/officeDocument/2006/math" xmlns:v="urn:schemas-microsoft-com:vml" xmlns:wp14="http://schemas.microsoft.com/office/word/2010/wordprocessingDrawing" xmlns:wp="http://schemas.openxmlformats.org/drawingml/2006/wordprocessingDrawing" xmlns:w10="urn:schemas-microsoft-com:office:word" xmlns:w="http://schemas.openxmlformats.org/wordprocessingml/2006/main" xmlns:w14="http://schemas.microsoft.com/office/word/2010/wordml" xmlns:w15="http://schemas.microsoft.com/office/word/2012/wordml" xmlns:w16cid="http://schemas.microsoft.com/office/word/2016/wordml/cid" xmlns:w16se="http://schemas.microsoft.com/office/word/2015/wordml/symex" xmlns:wpg="http://schemas.microsoft.com/office/word/2010/wordprocessingGroup" xmlns:wpi="http://schemas.microsoft.com/office/word/2010/wordprocessingInk" xmlns:wne="http://schemas.microsoft.com/office/word/2006/wordml" xmlns:wps="http://schemas.microsoft.com/office/word/2010/wordprocessingShape" mc:Ignorable="w14 w15 w16se w16cid wp14">
   <w:body>
     <w:p>
       <w:r>
@@ -682,7 +682,14 @@
                                 <w:rFonts w:ascii="Arial" w:hAnsi="Arial" w:cs="Arial"/>
                                 <w:szCs w:val="18"/>
                               </w:rPr>
-                              <w:t>003</w:t>
+                              <w:t>00</w:t>
+                            </w:r>
+                            <w:r>
+                              <w:rPr>
+                                <w:rFonts w:ascii="Arial" w:hAnsi="Arial" w:cs="Arial"/>
+                                <w:szCs w:val="18"/>
+                              </w:rPr>
+                              <w:t>4</w:t>
                             </w:r>
                           </w:p>
                         </w:txbxContent>
@@ -755,7 +762,14 @@
                           <w:rFonts w:ascii="Arial" w:hAnsi="Arial" w:cs="Arial"/>
                           <w:szCs w:val="18"/>
                         </w:rPr>
-                        <w:t>003</w:t>
+                        <w:t>00</w:t>
+                      </w:r>
+                      <w:r>
+                        <w:rPr>
+                          <w:rFonts w:ascii="Arial" w:hAnsi="Arial" w:cs="Arial"/>
+                          <w:szCs w:val="18"/>
+                        </w:rPr>
+                        <w:t>4</w:t>
                       </w:r>
                     </w:p>
                   </w:txbxContent>
@@ -965,7 +979,31 @@
                                 <w:b/>
                                 <w:sz w:val="28"/>
                               </w:rPr>
-                              <w:t>July 31, 2019</w:t>
+                              <w:t>November</w:t>
+                            </w:r>
+                            <w:r>
+                              <w:rPr>
+                                <w:rFonts w:ascii="Arial" w:hAnsi="Arial" w:cs="Arial"/>
+                                <w:b/>
+                                <w:sz w:val="28"/>
+                              </w:rPr>
+                              <w:t xml:space="preserve"> </w:t>
+                            </w:r>
+                            <w:r>
+                              <w:rPr>
+                                <w:rFonts w:ascii="Arial" w:hAnsi="Arial" w:cs="Arial"/>
+                                <w:b/>
+                                <w:sz w:val="28"/>
+                              </w:rPr>
+                              <w:t>14</w:t>
+                            </w:r>
+                            <w:r>
+                              <w:rPr>
+                                <w:rFonts w:ascii="Arial" w:hAnsi="Arial" w:cs="Arial"/>
+                                <w:b/>
+                                <w:sz w:val="28"/>
+                              </w:rPr>
+                              <w:t>, 2019</w:t>
                             </w:r>
                           </w:p>
                           <w:p>
@@ -1217,7 +1255,31 @@
                           <w:b/>
                           <w:sz w:val="28"/>
                         </w:rPr>
-                        <w:t>July 31, 2019</w:t>
+                        <w:t>November</w:t>
+                      </w:r>
+                      <w:r>
+                        <w:rPr>
+                          <w:rFonts w:ascii="Arial" w:hAnsi="Arial" w:cs="Arial"/>
+                          <w:b/>
+                          <w:sz w:val="28"/>
+                        </w:rPr>
+                        <w:t xml:space="preserve"> </w:t>
+                      </w:r>
+                      <w:r>
+                        <w:rPr>
+                          <w:rFonts w:ascii="Arial" w:hAnsi="Arial" w:cs="Arial"/>
+                          <w:b/>
+                          <w:sz w:val="28"/>
+                        </w:rPr>
+                        <w:t>14</w:t>
+                      </w:r>
+                      <w:r>
+                        <w:rPr>
+                          <w:rFonts w:ascii="Arial" w:hAnsi="Arial" w:cs="Arial"/>
+                          <w:b/>
+                          <w:sz w:val="28"/>
+                        </w:rPr>
+                        <w:t>, 2019</w:t>
                       </w:r>
                     </w:p>
                     <w:p>
@@ -4496,6 +4558,75 @@
           </w:p>
         </w:tc>
       </w:tr>
+      <w:tr>
+        <w:trPr>
+          <w:trHeight w:val="396"/>
+          <w:jc w:val="center"/>
+        </w:trPr>
+        <w:tc>
+          <w:tcPr>
+            <w:tcW w:w="1100" w:type="dxa"/>
+            <w:vAlign w:val="center"/>
+          </w:tcPr>
+          <w:p>
+            <w:pPr>
+              <w:pStyle w:val="Text"/>
+              <w:spacing w:after="0"/>
+              <w:jc w:val="center"/>
+            </w:pPr>
+            <w:r>
+              <w:t>4</w:t>
+            </w:r>
+          </w:p>
+        </w:tc>
+        <w:tc>
+          <w:tcPr>
+            <w:tcW w:w="1386" w:type="dxa"/>
+            <w:vAlign w:val="center"/>
+          </w:tcPr>
+          <w:p>
+            <w:pPr>
+              <w:pStyle w:val="Text"/>
+              <w:spacing w:after="0"/>
+              <w:jc w:val="center"/>
+            </w:pPr>
+            <w:r>
+              <w:t>11/14/2019</w:t>
+            </w:r>
+          </w:p>
+        </w:tc>
+        <w:tc>
+          <w:tcPr>
+            <w:tcW w:w="1800" w:type="dxa"/>
+            <w:vAlign w:val="center"/>
+          </w:tcPr>
+          <w:p>
+            <w:pPr>
+              <w:pStyle w:val="Text"/>
+              <w:spacing w:after="0"/>
+              <w:jc w:val="center"/>
+            </w:pPr>
+            <w:r>
+              <w:t>All</w:t>
+            </w:r>
+          </w:p>
+        </w:tc>
+        <w:tc>
+          <w:tcPr>
+            <w:tcW w:w="5310" w:type="dxa"/>
+            <w:vAlign w:val="center"/>
+          </w:tcPr>
+          <w:p>
+            <w:pPr>
+              <w:pStyle w:val="Text"/>
+              <w:spacing w:after="0"/>
+            </w:pPr>
+            <w:r>
+              <w:t>Minor revision for VERA version 4.1</w:t>
+            </w:r>
+          </w:p>
+        </w:tc>
+      </w:tr>
     </w:tbl>
     <w:p>
       <w:pPr>
@@ -5186,7 +5317,7 @@
                 <w:snapToGrid/>
                 <w:szCs w:val="22"/>
               </w:rPr>
-              <w:t>Scott Palmtag</w:t>
+              <w:t>Erik Walker</w:t>
             </w:r>
             <w:r>
               <w:rPr>
@@ -5464,40 +5595,6 @@
                 <w:snapToGrid/>
                 <w:szCs w:val="22"/>
               </w:rPr>
-              <w:t xml:space="preserve">Brendan </w:t>
-            </w:r>
-            <w:proofErr w:type="spellStart"/>
-            <w:r>
-              <w:rPr>
-                <w:rFonts w:ascii="Arial" w:eastAsia="Arial Unicode MS" w:hAnsi="Arial" w:cs="Arial"/>
-                <w:bCs/>
-                <w:iCs/>
-                <w:snapToGrid/>
-                <w:szCs w:val="22"/>
-              </w:rPr>
-              <w:t>Kochunas</w:t>
-            </w:r>
-            <w:proofErr w:type="spellEnd"/>
-            <w:r>
-              <w:rPr>
-                <w:rFonts w:ascii="Arial" w:eastAsia="Arial Unicode MS" w:hAnsi="Arial" w:cs="Arial"/>
-                <w:bCs/>
-                <w:iCs/>
-                <w:snapToGrid/>
-                <w:szCs w:val="22"/>
-              </w:rPr>
-              <w:t xml:space="preserve">, </w:t>
-            </w:r>
-            <w:bookmarkStart w:id="1" w:name="_GoBack"/>
-            <w:bookmarkEnd w:id="1"/>
-            <w:r>
-              <w:rPr>
-                <w:rFonts w:ascii="Arial" w:eastAsia="Arial Unicode MS" w:hAnsi="Arial" w:cs="Arial"/>
-                <w:bCs/>
-                <w:iCs/>
-                <w:snapToGrid/>
-                <w:szCs w:val="22"/>
-              </w:rPr>
               <w:t>Independent Reviewer</w:t>
             </w:r>
           </w:p>
@@ -5547,8 +5644,10 @@
                 <w:snapToGrid/>
                 <w:szCs w:val="22"/>
               </w:rPr>
-              <w:t>______________________</w:t>
+              <w:t>___________________</w:t>
             </w:r>
+            <w:bookmarkStart w:id="1" w:name="_GoBack"/>
+            <w:bookmarkEnd w:id="1"/>
           </w:p>
           <w:p>
             <w:pPr>
@@ -5710,7 +5809,7 @@
 </file>
 
 <file path=word/endnotes.xml><?xml version="1.0" encoding="utf-8"?>
-<w:endnotes xmlns:wpc="http://schemas.microsoft.com/office/word/2010/wordprocessingCanvas" xmlns:cx="http://schemas.microsoft.com/office/drawing/2014/chartex" xmlns:mc="http://schemas.openxmlformats.org/markup-compatibility/2006" xmlns:o="urn:schemas-microsoft-com:office:office" xmlns:r="http://schemas.openxmlformats.org/officeDocument/2006/relationships" xmlns:m="http://schemas.openxmlformats.org/officeDocument/2006/math" xmlns:v="urn:schemas-microsoft-com:vml" xmlns:wp14="http://schemas.microsoft.com/office/word/2010/wordprocessingDrawing" xmlns:wp="http://schemas.openxmlformats.org/drawingml/2006/wordprocessingDrawing" xmlns:w10="urn:schemas-microsoft-com:office:word" xmlns:w="http://schemas.openxmlformats.org/wordprocessingml/2006/main" xmlns:w14="http://schemas.microsoft.com/office/word/2010/wordml" xmlns:w15="http://schemas.microsoft.com/office/word/2012/wordml" xmlns:w16se="http://schemas.microsoft.com/office/word/2015/wordml/symex" xmlns:wpg="http://schemas.microsoft.com/office/word/2010/wordprocessingGroup" xmlns:wpi="http://schemas.microsoft.com/office/word/2010/wordprocessingInk" xmlns:wne="http://schemas.microsoft.com/office/word/2006/wordml" xmlns:wps="http://schemas.microsoft.com/office/word/2010/wordprocessingShape" mc:Ignorable="w14 w15 w16se wp14">
+<w:endnotes xmlns:wpc="http://schemas.microsoft.com/office/word/2010/wordprocessingCanvas" xmlns:cx="http://schemas.microsoft.com/office/drawing/2014/chartex" xmlns:cx1="http://schemas.microsoft.com/office/drawing/2015/9/8/chartex" xmlns:cx2="http://schemas.microsoft.com/office/drawing/2015/10/21/chartex" xmlns:cx3="http://schemas.microsoft.com/office/drawing/2016/5/9/chartex" xmlns:cx4="http://schemas.microsoft.com/office/drawing/2016/5/10/chartex" xmlns:cx5="http://schemas.microsoft.com/office/drawing/2016/5/11/chartex" xmlns:cx6="http://schemas.microsoft.com/office/drawing/2016/5/12/chartex" xmlns:cx7="http://schemas.microsoft.com/office/drawing/2016/5/13/chartex" xmlns:cx8="http://schemas.microsoft.com/office/drawing/2016/5/14/chartex" xmlns:mc="http://schemas.openxmlformats.org/markup-compatibility/2006" xmlns:aink="http://schemas.microsoft.com/office/drawing/2016/ink" xmlns:am3d="http://schemas.microsoft.com/office/drawing/2017/model3d" xmlns:o="urn:schemas-microsoft-com:office:office" xmlns:r="http://schemas.openxmlformats.org/officeDocument/2006/relationships" xmlns:m="http://schemas.openxmlformats.org/officeDocument/2006/math" xmlns:v="urn:schemas-microsoft-com:vml" xmlns:wp14="http://schemas.microsoft.com/office/word/2010/wordprocessingDrawing" xmlns:wp="http://schemas.openxmlformats.org/drawingml/2006/wordprocessingDrawing" xmlns:w10="urn:schemas-microsoft-com:office:word" xmlns:w="http://schemas.openxmlformats.org/wordprocessingml/2006/main" xmlns:w14="http://schemas.microsoft.com/office/word/2010/wordml" xmlns:w15="http://schemas.microsoft.com/office/word/2012/wordml" xmlns:w16cid="http://schemas.microsoft.com/office/word/2016/wordml/cid" xmlns:w16se="http://schemas.microsoft.com/office/word/2015/wordml/symex" xmlns:wpg="http://schemas.microsoft.com/office/word/2010/wordprocessingGroup" xmlns:wpi="http://schemas.microsoft.com/office/word/2010/wordprocessingInk" xmlns:wne="http://schemas.microsoft.com/office/word/2006/wordml" xmlns:wps="http://schemas.microsoft.com/office/word/2010/wordprocessingShape" mc:Ignorable="w14 w15 w16se w16cid wp14">
   <w:endnote w:type="separator" w:id="-1">
     <w:p>
       <w:r>
@@ -5729,7 +5828,7 @@
 </file>
 
 <file path=word/footer1.xml><?xml version="1.0" encoding="utf-8"?>
-<w:ftr xmlns:wpc="http://schemas.microsoft.com/office/word/2010/wordprocessingCanvas" xmlns:cx="http://schemas.microsoft.com/office/drawing/2014/chartex" xmlns:mc="http://schemas.openxmlformats.org/markup-compatibility/2006" xmlns:o="urn:schemas-microsoft-com:office:office" xmlns:r="http://schemas.openxmlformats.org/officeDocument/2006/relationships" xmlns:m="http://schemas.openxmlformats.org/officeDocument/2006/math" xmlns:v="urn:schemas-microsoft-com:vml" xmlns:wp14="http://schemas.microsoft.com/office/word/2010/wordprocessingDrawing" xmlns:wp="http://schemas.openxmlformats.org/drawingml/2006/wordprocessingDrawing" xmlns:w10="urn:schemas-microsoft-com:office:word" xmlns:w="http://schemas.openxmlformats.org/wordprocessingml/2006/main" xmlns:w14="http://schemas.microsoft.com/office/word/2010/wordml" xmlns:w15="http://schemas.microsoft.com/office/word/2012/wordml" xmlns:w16se="http://schemas.microsoft.com/office/word/2015/wordml/symex" xmlns:wpg="http://schemas.microsoft.com/office/word/2010/wordprocessingGroup" xmlns:wpi="http://schemas.microsoft.com/office/word/2010/wordprocessingInk" xmlns:wne="http://schemas.microsoft.com/office/word/2006/wordml" xmlns:wps="http://schemas.microsoft.com/office/word/2010/wordprocessingShape" mc:Ignorable="w14 w15 w16se wp14">
+<w:ftr xmlns:wpc="http://schemas.microsoft.com/office/word/2010/wordprocessingCanvas" xmlns:cx="http://schemas.microsoft.com/office/drawing/2014/chartex" xmlns:cx1="http://schemas.microsoft.com/office/drawing/2015/9/8/chartex" xmlns:cx2="http://schemas.microsoft.com/office/drawing/2015/10/21/chartex" xmlns:cx3="http://schemas.microsoft.com/office/drawing/2016/5/9/chartex" xmlns:cx4="http://schemas.microsoft.com/office/drawing/2016/5/10/chartex" xmlns:cx5="http://schemas.microsoft.com/office/drawing/2016/5/11/chartex" xmlns:cx6="http://schemas.microsoft.com/office/drawing/2016/5/12/chartex" xmlns:cx7="http://schemas.microsoft.com/office/drawing/2016/5/13/chartex" xmlns:cx8="http://schemas.microsoft.com/office/drawing/2016/5/14/chartex" xmlns:mc="http://schemas.openxmlformats.org/markup-compatibility/2006" xmlns:aink="http://schemas.microsoft.com/office/drawing/2016/ink" xmlns:am3d="http://schemas.microsoft.com/office/drawing/2017/model3d" xmlns:o="urn:schemas-microsoft-com:office:office" xmlns:r="http://schemas.openxmlformats.org/officeDocument/2006/relationships" xmlns:m="http://schemas.openxmlformats.org/officeDocument/2006/math" xmlns:v="urn:schemas-microsoft-com:vml" xmlns:wp14="http://schemas.microsoft.com/office/word/2010/wordprocessingDrawing" xmlns:wp="http://schemas.openxmlformats.org/drawingml/2006/wordprocessingDrawing" xmlns:w10="urn:schemas-microsoft-com:office:word" xmlns:w="http://schemas.openxmlformats.org/wordprocessingml/2006/main" xmlns:w14="http://schemas.microsoft.com/office/word/2010/wordml" xmlns:w15="http://schemas.microsoft.com/office/word/2012/wordml" xmlns:w16cid="http://schemas.microsoft.com/office/word/2016/wordml/cid" xmlns:w16se="http://schemas.microsoft.com/office/word/2015/wordml/symex" xmlns:wpg="http://schemas.microsoft.com/office/word/2010/wordprocessingGroup" xmlns:wpi="http://schemas.microsoft.com/office/word/2010/wordprocessingInk" xmlns:wne="http://schemas.microsoft.com/office/word/2006/wordml" xmlns:wps="http://schemas.microsoft.com/office/word/2010/wordprocessingShape" mc:Ignorable="w14 w15 w16se w16cid wp14">
   <w:sdt>
     <w:sdtPr>
       <w:rPr>
@@ -5901,7 +6000,16 @@
                 <w:sz w:val="18"/>
                 <w:szCs w:val="18"/>
               </w:rPr>
-              <w:t>CASL-U-2014-0014-003</w:t>
+              <w:t>CASL-U-2014-0014-00</w:t>
+            </w:r>
+            <w:r>
+              <w:rPr>
+                <w:rFonts w:ascii="Arial" w:hAnsi="Arial" w:cs="Arial"/>
+                <w:snapToGrid/>
+                <w:sz w:val="18"/>
+                <w:szCs w:val="18"/>
+              </w:rPr>
+              <w:t>4</w:t>
             </w:r>
           </w:p>
         </w:sdtContent>
@@ -5917,7 +6025,7 @@
 </file>
 
 <file path=word/footer2.xml><?xml version="1.0" encoding="utf-8"?>
-<w:ftr xmlns:wpc="http://schemas.microsoft.com/office/word/2010/wordprocessingCanvas" xmlns:cx="http://schemas.microsoft.com/office/drawing/2014/chartex" xmlns:mc="http://schemas.openxmlformats.org/markup-compatibility/2006" xmlns:o="urn:schemas-microsoft-com:office:office" xmlns:r="http://schemas.openxmlformats.org/officeDocument/2006/relationships" xmlns:m="http://schemas.openxmlformats.org/officeDocument/2006/math" xmlns:v="urn:schemas-microsoft-com:vml" xmlns:wp14="http://schemas.microsoft.com/office/word/2010/wordprocessingDrawing" xmlns:wp="http://schemas.openxmlformats.org/drawingml/2006/wordprocessingDrawing" xmlns:w10="urn:schemas-microsoft-com:office:word" xmlns:w="http://schemas.openxmlformats.org/wordprocessingml/2006/main" xmlns:w14="http://schemas.microsoft.com/office/word/2010/wordml" xmlns:w15="http://schemas.microsoft.com/office/word/2012/wordml" xmlns:w16se="http://schemas.microsoft.com/office/word/2015/wordml/symex" xmlns:wpg="http://schemas.microsoft.com/office/word/2010/wordprocessingGroup" xmlns:wpi="http://schemas.microsoft.com/office/word/2010/wordprocessingInk" xmlns:wne="http://schemas.microsoft.com/office/word/2006/wordml" xmlns:wps="http://schemas.microsoft.com/office/word/2010/wordprocessingShape" mc:Ignorable="w14 w15 w16se wp14">
+<w:ftr xmlns:wpc="http://schemas.microsoft.com/office/word/2010/wordprocessingCanvas" xmlns:cx="http://schemas.microsoft.com/office/drawing/2014/chartex" xmlns:cx1="http://schemas.microsoft.com/office/drawing/2015/9/8/chartex" xmlns:cx2="http://schemas.microsoft.com/office/drawing/2015/10/21/chartex" xmlns:cx3="http://schemas.microsoft.com/office/drawing/2016/5/9/chartex" xmlns:cx4="http://schemas.microsoft.com/office/drawing/2016/5/10/chartex" xmlns:cx5="http://schemas.microsoft.com/office/drawing/2016/5/11/chartex" xmlns:cx6="http://schemas.microsoft.com/office/drawing/2016/5/12/chartex" xmlns:cx7="http://schemas.microsoft.com/office/drawing/2016/5/13/chartex" xmlns:cx8="http://schemas.microsoft.com/office/drawing/2016/5/14/chartex" xmlns:mc="http://schemas.openxmlformats.org/markup-compatibility/2006" xmlns:aink="http://schemas.microsoft.com/office/drawing/2016/ink" xmlns:am3d="http://schemas.microsoft.com/office/drawing/2017/model3d" xmlns:o="urn:schemas-microsoft-com:office:office" xmlns:r="http://schemas.openxmlformats.org/officeDocument/2006/relationships" xmlns:m="http://schemas.openxmlformats.org/officeDocument/2006/math" xmlns:v="urn:schemas-microsoft-com:vml" xmlns:wp14="http://schemas.microsoft.com/office/word/2010/wordprocessingDrawing" xmlns:wp="http://schemas.openxmlformats.org/drawingml/2006/wordprocessingDrawing" xmlns:w10="urn:schemas-microsoft-com:office:word" xmlns:w="http://schemas.openxmlformats.org/wordprocessingml/2006/main" xmlns:w14="http://schemas.microsoft.com/office/word/2010/wordml" xmlns:w15="http://schemas.microsoft.com/office/word/2012/wordml" xmlns:w16cid="http://schemas.microsoft.com/office/word/2016/wordml/cid" xmlns:w16se="http://schemas.microsoft.com/office/word/2015/wordml/symex" xmlns:wpg="http://schemas.microsoft.com/office/word/2010/wordprocessingGroup" xmlns:wpi="http://schemas.microsoft.com/office/word/2010/wordprocessingInk" xmlns:wne="http://schemas.microsoft.com/office/word/2006/wordml" xmlns:wps="http://schemas.microsoft.com/office/word/2010/wordprocessingShape" mc:Ignorable="w14 w15 w16se w16cid wp14">
   <w:p>
     <w:pPr>
       <w:tabs>
@@ -6006,7 +6114,16 @@
                 <w:sz w:val="18"/>
                 <w:szCs w:val="18"/>
               </w:rPr>
-              <w:t>0014-003</w:t>
+              <w:t>0014-00</w:t>
+            </w:r>
+            <w:r>
+              <w:rPr>
+                <w:rFonts w:ascii="Arial" w:hAnsi="Arial" w:cs="Arial"/>
+                <w:snapToGrid/>
+                <w:sz w:val="18"/>
+                <w:szCs w:val="18"/>
+              </w:rPr>
+              <w:t>4</w:t>
             </w:r>
             <w:r>
               <w:rPr>
@@ -6129,7 +6246,7 @@
 </file>
 
 <file path=word/footnotes.xml><?xml version="1.0" encoding="utf-8"?>
-<w:footnotes xmlns:wpc="http://schemas.microsoft.com/office/word/2010/wordprocessingCanvas" xmlns:cx="http://schemas.microsoft.com/office/drawing/2014/chartex" xmlns:mc="http://schemas.openxmlformats.org/markup-compatibility/2006" xmlns:o="urn:schemas-microsoft-com:office:office" xmlns:r="http://schemas.openxmlformats.org/officeDocument/2006/relationships" xmlns:m="http://schemas.openxmlformats.org/officeDocument/2006/math" xmlns:v="urn:schemas-microsoft-com:vml" xmlns:wp14="http://schemas.microsoft.com/office/word/2010/wordprocessingDrawing" xmlns:wp="http://schemas.openxmlformats.org/drawingml/2006/wordprocessingDrawing" xmlns:w10="urn:schemas-microsoft-com:office:word" xmlns:w="http://schemas.openxmlformats.org/wordprocessingml/2006/main" xmlns:w14="http://schemas.microsoft.com/office/word/2010/wordml" xmlns:w15="http://schemas.microsoft.com/office/word/2012/wordml" xmlns:w16se="http://schemas.microsoft.com/office/word/2015/wordml/symex" xmlns:wpg="http://schemas.microsoft.com/office/word/2010/wordprocessingGroup" xmlns:wpi="http://schemas.microsoft.com/office/word/2010/wordprocessingInk" xmlns:wne="http://schemas.microsoft.com/office/word/2006/wordml" xmlns:wps="http://schemas.microsoft.com/office/word/2010/wordprocessingShape" mc:Ignorable="w14 w15 w16se wp14">
+<w:footnotes xmlns:wpc="http://schemas.microsoft.com/office/word/2010/wordprocessingCanvas" xmlns:cx="http://schemas.microsoft.com/office/drawing/2014/chartex" xmlns:cx1="http://schemas.microsoft.com/office/drawing/2015/9/8/chartex" xmlns:cx2="http://schemas.microsoft.com/office/drawing/2015/10/21/chartex" xmlns:cx3="http://schemas.microsoft.com/office/drawing/2016/5/9/chartex" xmlns:cx4="http://schemas.microsoft.com/office/drawing/2016/5/10/chartex" xmlns:cx5="http://schemas.microsoft.com/office/drawing/2016/5/11/chartex" xmlns:cx6="http://schemas.microsoft.com/office/drawing/2016/5/12/chartex" xmlns:cx7="http://schemas.microsoft.com/office/drawing/2016/5/13/chartex" xmlns:cx8="http://schemas.microsoft.com/office/drawing/2016/5/14/chartex" xmlns:mc="http://schemas.openxmlformats.org/markup-compatibility/2006" xmlns:aink="http://schemas.microsoft.com/office/drawing/2016/ink" xmlns:am3d="http://schemas.microsoft.com/office/drawing/2017/model3d" xmlns:o="urn:schemas-microsoft-com:office:office" xmlns:r="http://schemas.openxmlformats.org/officeDocument/2006/relationships" xmlns:m="http://schemas.openxmlformats.org/officeDocument/2006/math" xmlns:v="urn:schemas-microsoft-com:vml" xmlns:wp14="http://schemas.microsoft.com/office/word/2010/wordprocessingDrawing" xmlns:wp="http://schemas.openxmlformats.org/drawingml/2006/wordprocessingDrawing" xmlns:w10="urn:schemas-microsoft-com:office:word" xmlns:w="http://schemas.openxmlformats.org/wordprocessingml/2006/main" xmlns:w14="http://schemas.microsoft.com/office/word/2010/wordml" xmlns:w15="http://schemas.microsoft.com/office/word/2012/wordml" xmlns:w16cid="http://schemas.microsoft.com/office/word/2016/wordml/cid" xmlns:w16se="http://schemas.microsoft.com/office/word/2015/wordml/symex" xmlns:wpg="http://schemas.microsoft.com/office/word/2010/wordprocessingGroup" xmlns:wpi="http://schemas.microsoft.com/office/word/2010/wordprocessingInk" xmlns:wne="http://schemas.microsoft.com/office/word/2006/wordml" xmlns:wps="http://schemas.microsoft.com/office/word/2010/wordprocessingShape" mc:Ignorable="w14 w15 w16se w16cid wp14">
   <w:footnote w:type="separator" w:id="-1">
     <w:p>
       <w:r>
@@ -6148,7 +6265,7 @@
 </file>
 
 <file path=word/header1.xml><?xml version="1.0" encoding="utf-8"?>
-<w:hdr xmlns:wpc="http://schemas.microsoft.com/office/word/2010/wordprocessingCanvas" xmlns:cx="http://schemas.microsoft.com/office/drawing/2014/chartex" xmlns:mc="http://schemas.openxmlformats.org/markup-compatibility/2006" xmlns:o="urn:schemas-microsoft-com:office:office" xmlns:r="http://schemas.openxmlformats.org/officeDocument/2006/relationships" xmlns:m="http://schemas.openxmlformats.org/officeDocument/2006/math" xmlns:v="urn:schemas-microsoft-com:vml" xmlns:wp14="http://schemas.microsoft.com/office/word/2010/wordprocessingDrawing" xmlns:wp="http://schemas.openxmlformats.org/drawingml/2006/wordprocessingDrawing" xmlns:w10="urn:schemas-microsoft-com:office:word" xmlns:w="http://schemas.openxmlformats.org/wordprocessingml/2006/main" xmlns:w14="http://schemas.microsoft.com/office/word/2010/wordml" xmlns:w15="http://schemas.microsoft.com/office/word/2012/wordml" xmlns:w16se="http://schemas.microsoft.com/office/word/2015/wordml/symex" xmlns:wpg="http://schemas.microsoft.com/office/word/2010/wordprocessingGroup" xmlns:wpi="http://schemas.microsoft.com/office/word/2010/wordprocessingInk" xmlns:wne="http://schemas.microsoft.com/office/word/2006/wordml" xmlns:wps="http://schemas.microsoft.com/office/word/2010/wordprocessingShape" mc:Ignorable="w14 w15 w16se wp14">
+<w:hdr xmlns:wpc="http://schemas.microsoft.com/office/word/2010/wordprocessingCanvas" xmlns:cx="http://schemas.microsoft.com/office/drawing/2014/chartex" xmlns:cx1="http://schemas.microsoft.com/office/drawing/2015/9/8/chartex" xmlns:cx2="http://schemas.microsoft.com/office/drawing/2015/10/21/chartex" xmlns:cx3="http://schemas.microsoft.com/office/drawing/2016/5/9/chartex" xmlns:cx4="http://schemas.microsoft.com/office/drawing/2016/5/10/chartex" xmlns:cx5="http://schemas.microsoft.com/office/drawing/2016/5/11/chartex" xmlns:cx6="http://schemas.microsoft.com/office/drawing/2016/5/12/chartex" xmlns:cx7="http://schemas.microsoft.com/office/drawing/2016/5/13/chartex" xmlns:cx8="http://schemas.microsoft.com/office/drawing/2016/5/14/chartex" xmlns:mc="http://schemas.openxmlformats.org/markup-compatibility/2006" xmlns:aink="http://schemas.microsoft.com/office/drawing/2016/ink" xmlns:am3d="http://schemas.microsoft.com/office/drawing/2017/model3d" xmlns:o="urn:schemas-microsoft-com:office:office" xmlns:r="http://schemas.openxmlformats.org/officeDocument/2006/relationships" xmlns:m="http://schemas.openxmlformats.org/officeDocument/2006/math" xmlns:v="urn:schemas-microsoft-com:vml" xmlns:wp14="http://schemas.microsoft.com/office/word/2010/wordprocessingDrawing" xmlns:wp="http://schemas.openxmlformats.org/drawingml/2006/wordprocessingDrawing" xmlns:w10="urn:schemas-microsoft-com:office:word" xmlns:w="http://schemas.openxmlformats.org/wordprocessingml/2006/main" xmlns:w14="http://schemas.microsoft.com/office/word/2010/wordml" xmlns:w15="http://schemas.microsoft.com/office/word/2012/wordml" xmlns:w16cid="http://schemas.microsoft.com/office/word/2016/wordml/cid" xmlns:w16se="http://schemas.microsoft.com/office/word/2015/wordml/symex" xmlns:wpg="http://schemas.microsoft.com/office/word/2010/wordprocessingGroup" xmlns:wpi="http://schemas.microsoft.com/office/word/2010/wordprocessingInk" xmlns:wne="http://schemas.microsoft.com/office/word/2006/wordml" xmlns:wps="http://schemas.microsoft.com/office/word/2010/wordprocessingShape" mc:Ignorable="w14 w15 w16se w16cid wp14">
   <w:p>
     <w:pPr>
       <w:pStyle w:val="Header"/>
@@ -6233,7 +6350,7 @@
 </file>
 
 <file path=word/header2.xml><?xml version="1.0" encoding="utf-8"?>
-<w:hdr xmlns:wpc="http://schemas.microsoft.com/office/word/2010/wordprocessingCanvas" xmlns:cx="http://schemas.microsoft.com/office/drawing/2014/chartex" xmlns:mc="http://schemas.openxmlformats.org/markup-compatibility/2006" xmlns:o="urn:schemas-microsoft-com:office:office" xmlns:r="http://schemas.openxmlformats.org/officeDocument/2006/relationships" xmlns:m="http://schemas.openxmlformats.org/officeDocument/2006/math" xmlns:v="urn:schemas-microsoft-com:vml" xmlns:wp14="http://schemas.microsoft.com/office/word/2010/wordprocessingDrawing" xmlns:wp="http://schemas.openxmlformats.org/drawingml/2006/wordprocessingDrawing" xmlns:w10="urn:schemas-microsoft-com:office:word" xmlns:w="http://schemas.openxmlformats.org/wordprocessingml/2006/main" xmlns:w14="http://schemas.microsoft.com/office/word/2010/wordml" xmlns:w15="http://schemas.microsoft.com/office/word/2012/wordml" xmlns:w16se="http://schemas.microsoft.com/office/word/2015/wordml/symex" xmlns:wpg="http://schemas.microsoft.com/office/word/2010/wordprocessingGroup" xmlns:wpi="http://schemas.microsoft.com/office/word/2010/wordprocessingInk" xmlns:wne="http://schemas.microsoft.com/office/word/2006/wordml" xmlns:wps="http://schemas.microsoft.com/office/word/2010/wordprocessingShape" mc:Ignorable="w14 w15 w16se wp14">
+<w:hdr xmlns:wpc="http://schemas.microsoft.com/office/word/2010/wordprocessingCanvas" xmlns:cx="http://schemas.microsoft.com/office/drawing/2014/chartex" xmlns:cx1="http://schemas.microsoft.com/office/drawing/2015/9/8/chartex" xmlns:cx2="http://schemas.microsoft.com/office/drawing/2015/10/21/chartex" xmlns:cx3="http://schemas.microsoft.com/office/drawing/2016/5/9/chartex" xmlns:cx4="http://schemas.microsoft.com/office/drawing/2016/5/10/chartex" xmlns:cx5="http://schemas.microsoft.com/office/drawing/2016/5/11/chartex" xmlns:cx6="http://schemas.microsoft.com/office/drawing/2016/5/12/chartex" xmlns:cx7="http://schemas.microsoft.com/office/drawing/2016/5/13/chartex" xmlns:cx8="http://schemas.microsoft.com/office/drawing/2016/5/14/chartex" xmlns:mc="http://schemas.openxmlformats.org/markup-compatibility/2006" xmlns:aink="http://schemas.microsoft.com/office/drawing/2016/ink" xmlns:am3d="http://schemas.microsoft.com/office/drawing/2017/model3d" xmlns:o="urn:schemas-microsoft-com:office:office" xmlns:r="http://schemas.openxmlformats.org/officeDocument/2006/relationships" xmlns:m="http://schemas.openxmlformats.org/officeDocument/2006/math" xmlns:v="urn:schemas-microsoft-com:vml" xmlns:wp14="http://schemas.microsoft.com/office/word/2010/wordprocessingDrawing" xmlns:wp="http://schemas.openxmlformats.org/drawingml/2006/wordprocessingDrawing" xmlns:w10="urn:schemas-microsoft-com:office:word" xmlns:w="http://schemas.openxmlformats.org/wordprocessingml/2006/main" xmlns:w14="http://schemas.microsoft.com/office/word/2010/wordml" xmlns:w15="http://schemas.microsoft.com/office/word/2012/wordml" xmlns:w16cid="http://schemas.microsoft.com/office/word/2016/wordml/cid" xmlns:w16se="http://schemas.microsoft.com/office/word/2015/wordml/symex" xmlns:wpg="http://schemas.microsoft.com/office/word/2010/wordprocessingGroup" xmlns:wpi="http://schemas.microsoft.com/office/word/2010/wordprocessingInk" xmlns:wne="http://schemas.microsoft.com/office/word/2006/wordml" xmlns:wps="http://schemas.microsoft.com/office/word/2010/wordprocessingShape" mc:Ignorable="w14 w15 w16se w16cid wp14">
   <w:p>
     <w:pPr>
       <w:tabs>
@@ -6331,7 +6448,7 @@
 </file>
 
 <file path=word/header3.xml><?xml version="1.0" encoding="utf-8"?>
-<w:hdr xmlns:wpc="http://schemas.microsoft.com/office/word/2010/wordprocessingCanvas" xmlns:cx="http://schemas.microsoft.com/office/drawing/2014/chartex" xmlns:mc="http://schemas.openxmlformats.org/markup-compatibility/2006" xmlns:o="urn:schemas-microsoft-com:office:office" xmlns:r="http://schemas.openxmlformats.org/officeDocument/2006/relationships" xmlns:m="http://schemas.openxmlformats.org/officeDocument/2006/math" xmlns:v="urn:schemas-microsoft-com:vml" xmlns:wp14="http://schemas.microsoft.com/office/word/2010/wordprocessingDrawing" xmlns:wp="http://schemas.openxmlformats.org/drawingml/2006/wordprocessingDrawing" xmlns:w10="urn:schemas-microsoft-com:office:word" xmlns:w="http://schemas.openxmlformats.org/wordprocessingml/2006/main" xmlns:w14="http://schemas.microsoft.com/office/word/2010/wordml" xmlns:w15="http://schemas.microsoft.com/office/word/2012/wordml" xmlns:w16se="http://schemas.microsoft.com/office/word/2015/wordml/symex" xmlns:wpg="http://schemas.microsoft.com/office/word/2010/wordprocessingGroup" xmlns:wpi="http://schemas.microsoft.com/office/word/2010/wordprocessingInk" xmlns:wne="http://schemas.microsoft.com/office/word/2006/wordml" xmlns:wps="http://schemas.microsoft.com/office/word/2010/wordprocessingShape" mc:Ignorable="w14 w15 w16se wp14">
+<w:hdr xmlns:wpc="http://schemas.microsoft.com/office/word/2010/wordprocessingCanvas" xmlns:cx="http://schemas.microsoft.com/office/drawing/2014/chartex" xmlns:cx1="http://schemas.microsoft.com/office/drawing/2015/9/8/chartex" xmlns:cx2="http://schemas.microsoft.com/office/drawing/2015/10/21/chartex" xmlns:cx3="http://schemas.microsoft.com/office/drawing/2016/5/9/chartex" xmlns:cx4="http://schemas.microsoft.com/office/drawing/2016/5/10/chartex" xmlns:cx5="http://schemas.microsoft.com/office/drawing/2016/5/11/chartex" xmlns:cx6="http://schemas.microsoft.com/office/drawing/2016/5/12/chartex" xmlns:cx7="http://schemas.microsoft.com/office/drawing/2016/5/13/chartex" xmlns:cx8="http://schemas.microsoft.com/office/drawing/2016/5/14/chartex" xmlns:mc="http://schemas.openxmlformats.org/markup-compatibility/2006" xmlns:aink="http://schemas.microsoft.com/office/drawing/2016/ink" xmlns:am3d="http://schemas.microsoft.com/office/drawing/2017/model3d" xmlns:o="urn:schemas-microsoft-com:office:office" xmlns:r="http://schemas.openxmlformats.org/officeDocument/2006/relationships" xmlns:m="http://schemas.openxmlformats.org/officeDocument/2006/math" xmlns:v="urn:schemas-microsoft-com:vml" xmlns:wp14="http://schemas.microsoft.com/office/word/2010/wordprocessingDrawing" xmlns:wp="http://schemas.openxmlformats.org/drawingml/2006/wordprocessingDrawing" xmlns:w10="urn:schemas-microsoft-com:office:word" xmlns:w="http://schemas.openxmlformats.org/wordprocessingml/2006/main" xmlns:w14="http://schemas.microsoft.com/office/word/2010/wordml" xmlns:w15="http://schemas.microsoft.com/office/word/2012/wordml" xmlns:w16cid="http://schemas.microsoft.com/office/word/2016/wordml/cid" xmlns:w16se="http://schemas.microsoft.com/office/word/2015/wordml/symex" xmlns:wpg="http://schemas.microsoft.com/office/word/2010/wordprocessingGroup" xmlns:wpi="http://schemas.microsoft.com/office/word/2010/wordprocessingInk" xmlns:wne="http://schemas.microsoft.com/office/word/2006/wordml" xmlns:wps="http://schemas.microsoft.com/office/word/2010/wordprocessingShape" mc:Ignorable="w14 w15 w16se w16cid wp14">
   <w:p>
     <w:pPr>
       <w:pStyle w:val="Header"/>
@@ -6543,7 +6660,7 @@
 </file>
 
 <file path=word/numbering.xml><?xml version="1.0" encoding="utf-8"?>
-<w:numbering xmlns:wpc="http://schemas.microsoft.com/office/word/2010/wordprocessingCanvas" xmlns:cx="http://schemas.microsoft.com/office/drawing/2014/chartex" xmlns:mc="http://schemas.openxmlformats.org/markup-compatibility/2006" xmlns:o="urn:schemas-microsoft-com:office:office" xmlns:r="http://schemas.openxmlformats.org/officeDocument/2006/relationships" xmlns:m="http://schemas.openxmlformats.org/officeDocument/2006/math" xmlns:v="urn:schemas-microsoft-com:vml" xmlns:wp14="http://schemas.microsoft.com/office/word/2010/wordprocessingDrawing" xmlns:wp="http://schemas.openxmlformats.org/drawingml/2006/wordprocessingDrawing" xmlns:w10="urn:schemas-microsoft-com:office:word" xmlns:w="http://schemas.openxmlformats.org/wordprocessingml/2006/main" xmlns:w14="http://schemas.microsoft.com/office/word/2010/wordml" xmlns:w15="http://schemas.microsoft.com/office/word/2012/wordml" xmlns:w16se="http://schemas.microsoft.com/office/word/2015/wordml/symex" xmlns:wpg="http://schemas.microsoft.com/office/word/2010/wordprocessingGroup" xmlns:wpi="http://schemas.microsoft.com/office/word/2010/wordprocessingInk" xmlns:wne="http://schemas.microsoft.com/office/word/2006/wordml" xmlns:wps="http://schemas.microsoft.com/office/word/2010/wordprocessingShape" mc:Ignorable="w14 w15 w16se wp14">
+<w:numbering xmlns:wpc="http://schemas.microsoft.com/office/word/2010/wordprocessingCanvas" xmlns:cx="http://schemas.microsoft.com/office/drawing/2014/chartex" xmlns:cx1="http://schemas.microsoft.com/office/drawing/2015/9/8/chartex" xmlns:cx2="http://schemas.microsoft.com/office/drawing/2015/10/21/chartex" xmlns:cx3="http://schemas.microsoft.com/office/drawing/2016/5/9/chartex" xmlns:cx4="http://schemas.microsoft.com/office/drawing/2016/5/10/chartex" xmlns:cx5="http://schemas.microsoft.com/office/drawing/2016/5/11/chartex" xmlns:cx6="http://schemas.microsoft.com/office/drawing/2016/5/12/chartex" xmlns:cx7="http://schemas.microsoft.com/office/drawing/2016/5/13/chartex" xmlns:cx8="http://schemas.microsoft.com/office/drawing/2016/5/14/chartex" xmlns:mc="http://schemas.openxmlformats.org/markup-compatibility/2006" xmlns:aink="http://schemas.microsoft.com/office/drawing/2016/ink" xmlns:am3d="http://schemas.microsoft.com/office/drawing/2017/model3d" xmlns:o="urn:schemas-microsoft-com:office:office" xmlns:r="http://schemas.openxmlformats.org/officeDocument/2006/relationships" xmlns:m="http://schemas.openxmlformats.org/officeDocument/2006/math" xmlns:v="urn:schemas-microsoft-com:vml" xmlns:wp14="http://schemas.microsoft.com/office/word/2010/wordprocessingDrawing" xmlns:wp="http://schemas.openxmlformats.org/drawingml/2006/wordprocessingDrawing" xmlns:w10="urn:schemas-microsoft-com:office:word" xmlns:w="http://schemas.openxmlformats.org/wordprocessingml/2006/main" xmlns:w14="http://schemas.microsoft.com/office/word/2010/wordml" xmlns:w15="http://schemas.microsoft.com/office/word/2012/wordml" xmlns:w16cid="http://schemas.microsoft.com/office/word/2016/wordml/cid" xmlns:w16se="http://schemas.microsoft.com/office/word/2015/wordml/symex" xmlns:wpg="http://schemas.microsoft.com/office/word/2010/wordprocessingGroup" xmlns:wpi="http://schemas.microsoft.com/office/word/2010/wordprocessingInk" xmlns:wne="http://schemas.microsoft.com/office/word/2006/wordml" xmlns:wps="http://schemas.microsoft.com/office/word/2010/wordprocessingShape" mc:Ignorable="w14 w15 w16se w16cid wp14">
   <w:abstractNum w:abstractNumId="0" w15:restartNumberingAfterBreak="0">
     <w:nsid w:val="FFFFFF82"/>
     <w:multiLevelType w:val="singleLevel"/>
@@ -7126,7 +7243,7 @@
 </file>
 
 <file path=word/styles.xml><?xml version="1.0" encoding="utf-8"?>
-<w:styles xmlns:mc="http://schemas.openxmlformats.org/markup-compatibility/2006" xmlns:r="http://schemas.openxmlformats.org/officeDocument/2006/relationships" xmlns:w="http://schemas.openxmlformats.org/wordprocessingml/2006/main" xmlns:w14="http://schemas.microsoft.com/office/word/2010/wordml" xmlns:w15="http://schemas.microsoft.com/office/word/2012/wordml" xmlns:w16se="http://schemas.microsoft.com/office/word/2015/wordml/symex" mc:Ignorable="w14 w15 w16se">
+<w:styles xmlns:mc="http://schemas.openxmlformats.org/markup-compatibility/2006" xmlns:r="http://schemas.openxmlformats.org/officeDocument/2006/relationships" xmlns:w="http://schemas.openxmlformats.org/wordprocessingml/2006/main" xmlns:w14="http://schemas.microsoft.com/office/word/2010/wordml" xmlns:w15="http://schemas.microsoft.com/office/word/2012/wordml" xmlns:w16cid="http://schemas.microsoft.com/office/word/2016/wordml/cid" xmlns:w16se="http://schemas.microsoft.com/office/word/2015/wordml/symex" mc:Ignorable="w14 w15 w16se w16cid">
   <w:docDefaults>
     <w:rPrDefault>
       <w:rPr>
@@ -7136,7 +7253,7 @@
     </w:rPrDefault>
     <w:pPrDefault/>
   </w:docDefaults>
-  <w:latentStyles w:defLockedState="0" w:defUIPriority="99" w:defSemiHidden="0" w:defUnhideWhenUsed="0" w:defQFormat="0" w:count="371">
+  <w:latentStyles w:defLockedState="0" w:defUIPriority="99" w:defSemiHidden="0" w:defUnhideWhenUsed="0" w:defQFormat="0" w:count="377">
     <w:lsdException w:name="Normal" w:uiPriority="0" w:qFormat="1"/>
     <w:lsdException w:name="heading 1" w:uiPriority="0" w:qFormat="1"/>
     <w:lsdException w:name="heading 2" w:semiHidden="1" w:uiPriority="0" w:unhideWhenUsed="1" w:qFormat="1"/>
@@ -7284,11 +7401,8 @@
     <w:lsdException w:name="Table 3D effects 3" w:semiHidden="1" w:unhideWhenUsed="1"/>
     <w:lsdException w:name="Table Contemporary" w:semiHidden="1" w:unhideWhenUsed="1"/>
     <w:lsdException w:name="Table Elegant" w:semiHidden="1" w:unhideWhenUsed="1"/>
-    <w:lsdException w:name="Table Professional" w:semiHidden="1" w:unhideWhenUsed="1"/>
     <w:lsdException w:name="Table Subtle 1" w:semiHidden="1" w:unhideWhenUsed="1"/>
     <w:lsdException w:name="Table Subtle 2" w:semiHidden="1" w:unhideWhenUsed="1"/>
-    <w:lsdException w:name="Table Web 1" w:semiHidden="1" w:unhideWhenUsed="1"/>
-    <w:lsdException w:name="Table Web 2" w:semiHidden="1" w:unhideWhenUsed="1"/>
     <w:lsdException w:name="Table Web 3" w:semiHidden="1" w:unhideWhenUsed="1"/>
     <w:lsdException w:name="Balloon Text" w:semiHidden="1" w:unhideWhenUsed="1"/>
     <w:lsdException w:name="Table Grid" w:uiPriority="1"/>
@@ -7508,6 +7622,12 @@
     <w:lsdException w:name="List Table 5 Dark Accent 6" w:uiPriority="50"/>
     <w:lsdException w:name="List Table 6 Colorful Accent 6" w:uiPriority="51"/>
     <w:lsdException w:name="List Table 7 Colorful Accent 6" w:uiPriority="52"/>
+    <w:lsdException w:name="Mention" w:semiHidden="1" w:unhideWhenUsed="1"/>
+    <w:lsdException w:name="Smart Hyperlink" w:semiHidden="1" w:unhideWhenUsed="1"/>
+    <w:lsdException w:name="Hashtag" w:semiHidden="1" w:unhideWhenUsed="1"/>
+    <w:lsdException w:name="Unresolved Mention" w:semiHidden="1" w:unhideWhenUsed="1"/>
+    <w:lsdException w:name="Smart Link" w:semiHidden="1" w:unhideWhenUsed="1"/>
+    <w:lsdException w:name="Smart Link Error" w:semiHidden="1" w:unhideWhenUsed="1"/>
   </w:latentStyles>
   <w:style w:type="paragraph" w:default="1" w:styleId="Normal">
     <w:name w:val="Normal"/>
@@ -8847,25 +8967,6 @@
 </file>
 
 <file path=customXml/item1.xml><?xml version="1.0" encoding="utf-8"?>
-<?mso-contentType ?>
-<FormTemplates xmlns="http://schemas.microsoft.com/sharepoint/v3/contenttype/forms">
-  <Display>DocumentLibraryForm</Display>
-  <Edit>DocumentLibraryForm</Edit>
-  <New>DocumentLibraryForm</New>
-</FormTemplates>
-</file>
-
-<file path=customXml/item2.xml><?xml version="1.0" encoding="utf-8"?>
-<p:properties xmlns:p="http://schemas.microsoft.com/office/2006/metadata/properties" xmlns:xsi="http://www.w3.org/2001/XMLSchema-instance" xmlns:pc="http://schemas.microsoft.com/office/infopath/2007/PartnerControls">
-  <documentManagement>
-    <IconOverlay xmlns="http://schemas.microsoft.com/sharepoint/v4" xsi:nil="true"/>
-    <AxSourceListID xmlns="2df79c4b-422a-4389-bee9-4052db243df7" xsi:nil="true"/>
-    <AxSourceItemID xmlns="2df79c4b-422a-4389-bee9-4052db243df7" xsi:nil="true"/>
-  </documentManagement>
-</p:properties>
-</file>
-
-<file path=customXml/item3.xml><?xml version="1.0" encoding="utf-8"?>
 <ct:contentTypeSchema xmlns:ct="http://schemas.microsoft.com/office/2006/metadata/contentType" xmlns:ma="http://schemas.microsoft.com/office/2006/metadata/properties/metaAttributes" ct:_="" ma:_="" ma:contentTypeName="Document" ma:contentTypeID="0x010100736BE9B5A985734A847479BB3367DB52" ma:contentTypeVersion="4" ma:contentTypeDescription="Create a new document." ma:contentTypeScope="" ma:versionID="498ed53d1c82b145cd9a82d443a6efce">
   <xsd:schema xmlns:xsd="http://www.w3.org/2001/XMLSchema" xmlns:xs="http://www.w3.org/2001/XMLSchema" xmlns:p="http://schemas.microsoft.com/office/2006/metadata/properties" xmlns:ns2="2df79c4b-422a-4389-bee9-4052db243df7" xmlns:ns3="http://schemas.microsoft.com/sharepoint/v4" targetNamespace="http://schemas.microsoft.com/office/2006/metadata/properties" ma:root="true" ma:fieldsID="246148f0a1c058b8f4e618a7dc08c8a1" ns2:_="" ns3:_="">
     <xsd:import namespace="2df79c4b-422a-4389-bee9-4052db243df7"/>
@@ -9008,30 +9109,30 @@
 </ct:contentTypeSchema>
 </file>
 
+<file path=customXml/item2.xml><?xml version="1.0" encoding="utf-8"?>
+<p:properties xmlns:p="http://schemas.microsoft.com/office/2006/metadata/properties" xmlns:xsi="http://www.w3.org/2001/XMLSchema-instance" xmlns:pc="http://schemas.microsoft.com/office/infopath/2007/PartnerControls">
+  <documentManagement>
+    <IconOverlay xmlns="http://schemas.microsoft.com/sharepoint/v4" xsi:nil="true"/>
+    <AxSourceListID xmlns="2df79c4b-422a-4389-bee9-4052db243df7" xsi:nil="true"/>
+    <AxSourceItemID xmlns="2df79c4b-422a-4389-bee9-4052db243df7" xsi:nil="true"/>
+  </documentManagement>
+</p:properties>
+</file>
+
+<file path=customXml/item3.xml><?xml version="1.0" encoding="utf-8"?>
+<?mso-contentType ?>
+<FormTemplates xmlns="http://schemas.microsoft.com/sharepoint/v3/contenttype/forms">
+  <Display>DocumentLibraryForm</Display>
+  <Edit>DocumentLibraryForm</Edit>
+  <New>DocumentLibraryForm</New>
+</FormTemplates>
+</file>
+
 <file path=customXml/item4.xml><?xml version="1.0" encoding="utf-8"?>
 <b:Sources xmlns:b="http://schemas.openxmlformats.org/officeDocument/2006/bibliography" xmlns="http://schemas.openxmlformats.org/officeDocument/2006/bibliography" SelectedStyle="\APA.XSL" StyleName="APA"/>
 </file>
 
 <file path=customXml/itemProps1.xml><?xml version="1.0" encoding="utf-8"?>
-<ds:datastoreItem xmlns:ds="http://schemas.openxmlformats.org/officeDocument/2006/customXml" ds:itemID="{C9B4D2A0-8AA5-4FEC-B315-C34E9751B97C}">
-  <ds:schemaRefs>
-    <ds:schemaRef ds:uri="http://schemas.microsoft.com/sharepoint/v3/contenttype/forms"/>
-  </ds:schemaRefs>
-</ds:datastoreItem>
-</file>
-
-<file path=customXml/itemProps2.xml><?xml version="1.0" encoding="utf-8"?>
-<ds:datastoreItem xmlns:ds="http://schemas.openxmlformats.org/officeDocument/2006/customXml" ds:itemID="{D426956D-E14D-414F-869A-3689EA34EC47}">
-  <ds:schemaRefs>
-    <ds:schemaRef ds:uri="http://schemas.microsoft.com/office/2006/metadata/properties"/>
-    <ds:schemaRef ds:uri="http://schemas.microsoft.com/office/infopath/2007/PartnerControls"/>
-    <ds:schemaRef ds:uri="http://schemas.microsoft.com/sharepoint/v4"/>
-    <ds:schemaRef ds:uri="2df79c4b-422a-4389-bee9-4052db243df7"/>
-  </ds:schemaRefs>
-</ds:datastoreItem>
-</file>
-
-<file path=customXml/itemProps3.xml><?xml version="1.0" encoding="utf-8"?>
 <ds:datastoreItem xmlns:ds="http://schemas.openxmlformats.org/officeDocument/2006/customXml" ds:itemID="{6E118B79-CD8D-4DD4-A53B-98A077F090ED}">
   <ds:schemaRefs>
     <ds:schemaRef ds:uri="http://schemas.microsoft.com/office/2006/metadata/contentType"/>
@@ -9050,8 +9151,27 @@
 </ds:datastoreItem>
 </file>
 
+<file path=customXml/itemProps2.xml><?xml version="1.0" encoding="utf-8"?>
+<ds:datastoreItem xmlns:ds="http://schemas.openxmlformats.org/officeDocument/2006/customXml" ds:itemID="{D426956D-E14D-414F-869A-3689EA34EC47}">
+  <ds:schemaRefs>
+    <ds:schemaRef ds:uri="http://schemas.microsoft.com/office/2006/metadata/properties"/>
+    <ds:schemaRef ds:uri="http://schemas.microsoft.com/office/infopath/2007/PartnerControls"/>
+    <ds:schemaRef ds:uri="http://schemas.microsoft.com/sharepoint/v4"/>
+    <ds:schemaRef ds:uri="2df79c4b-422a-4389-bee9-4052db243df7"/>
+  </ds:schemaRefs>
+</ds:datastoreItem>
+</file>
+
+<file path=customXml/itemProps3.xml><?xml version="1.0" encoding="utf-8"?>
+<ds:datastoreItem xmlns:ds="http://schemas.openxmlformats.org/officeDocument/2006/customXml" ds:itemID="{C9B4D2A0-8AA5-4FEC-B315-C34E9751B97C}">
+  <ds:schemaRefs>
+    <ds:schemaRef ds:uri="http://schemas.microsoft.com/sharepoint/v3/contenttype/forms"/>
+  </ds:schemaRefs>
+</ds:datastoreItem>
+</file>
+
 <file path=customXml/itemProps4.xml><?xml version="1.0" encoding="utf-8"?>
-<ds:datastoreItem xmlns:ds="http://schemas.openxmlformats.org/officeDocument/2006/customXml" ds:itemID="{924E4EEB-484E-4E9F-B68A-0451C08DF4BE}">
+<ds:datastoreItem xmlns:ds="http://schemas.openxmlformats.org/officeDocument/2006/customXml" ds:itemID="{5FB2DF0F-5FE9-48F6-9EFD-668801048448}">
   <ds:schemaRefs>
     <ds:schemaRef ds:uri="http://schemas.openxmlformats.org/officeDocument/2006/bibliography"/>
   </ds:schemaRefs>

</xml_diff>